<commit_message>
feat: implement document generation server with template support and SQL API integration
</commit_message>
<xml_diff>
--- a/backend-app/samples/BEO_Tiec_Cuoi.docx
+++ b/backend-app/samples/BEO_Tiec_Cuoi.docx
@@ -157,38 +157,7 @@
                 <w:b/>
                 <w:sz w:val="16"/>
               </w:rPr>
-              <w:t>PHIẾU</w:t>
-            </w:r>
-            <w:r>
-              <w:rPr>
-                <w:b/>
-                <w:spacing w:val="-3"/>
-                <w:sz w:val="16"/>
-              </w:rPr>
-              <w:t> </w:t>
-            </w:r>
-            <w:r>
-              <w:rPr>
-                <w:b/>
-                <w:sz w:val="16"/>
-              </w:rPr>
-              <w:t>ĐẶT</w:t>
-            </w:r>
-            <w:r>
-              <w:rPr>
-                <w:b/>
-                <w:spacing w:val="-2"/>
-                <w:sz w:val="16"/>
-              </w:rPr>
-              <w:t> </w:t>
-            </w:r>
-            <w:r>
-              <w:rPr>
-                <w:b/>
-                <w:spacing w:val="-4"/>
-                <w:sz w:val="16"/>
-              </w:rPr>
-              <w:t>TIỆC</w:t>
+              <w:t>{TieuDePhieu}</w:t>
             </w:r>
           </w:p>
         </w:tc>
@@ -280,21 +249,7 @@
               <w:rPr>
                 <w:sz w:val="14"/>
               </w:rPr>
-              <w:t>Mộng</w:t>
-            </w:r>
-            <w:r>
-              <w:rPr>
-                <w:spacing w:val="3"/>
-                <w:sz w:val="14"/>
-              </w:rPr>
-              <w:t> </w:t>
-            </w:r>
-            <w:r>
-              <w:rPr>
-                <w:spacing w:val="-4"/>
-                <w:sz w:val="14"/>
-              </w:rPr>
-              <w:t>Tuyền</w:t>
+              <w:t>{BenA_NhanVienPhuTrach}</w:t>
             </w:r>
           </w:p>
         </w:tc>
@@ -321,58 +276,7 @@
                 <w:sz w:val="14"/>
                 <w:u w:val="single"/>
               </w:rPr>
-              <w:t>Tel:</w:t>
-            </w:r>
-            <w:r>
-              <w:rPr>
-                <w:sz w:val="14"/>
-              </w:rPr>
-              <w:t> :</w:t>
-            </w:r>
-            <w:r>
-              <w:rPr>
-                <w:spacing w:val="1"/>
-                <w:sz w:val="14"/>
-              </w:rPr>
-              <w:t> </w:t>
-            </w:r>
-            <w:r>
-              <w:rPr>
-                <w:sz w:val="14"/>
-                <w:u w:val="single"/>
-              </w:rPr>
-              <w:t>0392</w:t>
-            </w:r>
-            <w:r>
-              <w:rPr>
-                <w:spacing w:val="5"/>
-                <w:sz w:val="14"/>
-                <w:u w:val="single"/>
-              </w:rPr>
-              <w:t> </w:t>
-            </w:r>
-            <w:r>
-              <w:rPr>
-                <w:sz w:val="14"/>
-                <w:u w:val="single"/>
-              </w:rPr>
-              <w:t>001</w:t>
-            </w:r>
-            <w:r>
-              <w:rPr>
-                <w:spacing w:val="5"/>
-                <w:sz w:val="14"/>
-                <w:u w:val="single"/>
-              </w:rPr>
-              <w:t> </w:t>
-            </w:r>
-            <w:r>
-              <w:rPr>
-                <w:spacing w:val="-5"/>
-                <w:sz w:val="14"/>
-                <w:u w:val="single"/>
-              </w:rPr>
-              <w:t>803</w:t>
+              <w:t>Tel: {BenA_SDT_NhanVien}</w:t>
             </w:r>
           </w:p>
         </w:tc>
@@ -491,7 +395,7 @@
                 <w:sz w:val="14"/>
                 <w:u w:val="single"/>
               </w:rPr>
-              <w:t>số: 01/11-HHKH2025,</w:t>
+              <w:t>số: {Sohopdong},</w:t>
             </w:r>
             <w:r>
               <w:rPr>
@@ -529,7 +433,7 @@
                 <w:sz w:val="14"/>
                 <w:u w:val="single"/>
               </w:rPr>
-              <w:t> 01/11/2025</w:t>
+              <w:t> {NgayHopDong}</w:t>
             </w:r>
           </w:p>
         </w:tc>
@@ -650,7 +554,7 @@
                 <w:sz w:val="14"/>
                 <w:u w:val="single"/>
               </w:rPr>
-              <w:t>12/04/2026</w:t>
+              <w:t>{NgayRaBEO}</w:t>
             </w:r>
           </w:p>
         </w:tc>
@@ -802,7 +706,7 @@
                 <w:b/>
                 <w:sz w:val="14"/>
               </w:rPr>
-              <w:t>NGUYỄN PHƯƠNG DUY</w:t>
+              <w:t>{Tenchure}</w:t>
             </w:r>
             <w:r>
               <w:rPr>
@@ -817,7 +721,7 @@
                 <w:b/>
                 <w:sz w:val="14"/>
               </w:rPr>
-              <w:t>NGUYỄN HỒ THU PHƯỢNG</w:t>
+              <w:t>{Tencodau}</w:t>
             </w:r>
           </w:p>
         </w:tc>
@@ -894,7 +798,7 @@
                 <w:spacing w:val="-2"/>
                 <w:sz w:val="14"/>
               </w:rPr>
-              <w:t>06.06.2026</w:t>
+              <w:t>{NgayToChuc}</w:t>
             </w:r>
           </w:p>
         </w:tc>
@@ -973,86 +877,7 @@
               <w:rPr>
                 <w:sz w:val="14"/>
               </w:rPr>
-              <w:t>21/08/11</w:t>
-            </w:r>
-            <w:r>
-              <w:rPr>
-                <w:spacing w:val="2"/>
-                <w:sz w:val="14"/>
-              </w:rPr>
-              <w:t> </w:t>
-            </w:r>
-            <w:r>
-              <w:rPr>
-                <w:sz w:val="14"/>
-              </w:rPr>
-              <w:t>Lê</w:t>
-            </w:r>
-            <w:r>
-              <w:rPr>
-                <w:spacing w:val="3"/>
-                <w:sz w:val="14"/>
-              </w:rPr>
-              <w:t> </w:t>
-            </w:r>
-            <w:r>
-              <w:rPr>
-                <w:sz w:val="14"/>
-              </w:rPr>
-              <w:t>Công Phép,</w:t>
-            </w:r>
-            <w:r>
-              <w:rPr>
-                <w:spacing w:val="2"/>
-                <w:sz w:val="14"/>
-              </w:rPr>
-              <w:t> </w:t>
-            </w:r>
-            <w:r>
-              <w:rPr>
-                <w:sz w:val="14"/>
-              </w:rPr>
-              <w:t>P.</w:t>
-            </w:r>
-            <w:r>
-              <w:rPr>
-                <w:spacing w:val="3"/>
-                <w:sz w:val="14"/>
-              </w:rPr>
-              <w:t> </w:t>
-            </w:r>
-            <w:r>
-              <w:rPr>
-                <w:sz w:val="14"/>
-              </w:rPr>
-              <w:t>An</w:t>
-            </w:r>
-            <w:r>
-              <w:rPr>
-                <w:spacing w:val="3"/>
-                <w:sz w:val="14"/>
-              </w:rPr>
-              <w:t> </w:t>
-            </w:r>
-            <w:r>
-              <w:rPr>
-                <w:sz w:val="14"/>
-              </w:rPr>
-              <w:t>Lạc,</w:t>
-            </w:r>
-            <w:r>
-              <w:rPr>
-                <w:spacing w:val="2"/>
-                <w:sz w:val="14"/>
-              </w:rPr>
-              <w:t> </w:t>
-            </w:r>
-            <w:r>
-              <w:rPr>
-                <w:spacing w:val="-4"/>
-                <w:sz w:val="14"/>
-              </w:rPr>
-              <w:t>TPHCM</w:t>
+              <w:t>{BenB_DiaChi}</w:t>
             </w:r>
           </w:p>
         </w:tc>
@@ -1255,7 +1080,20 @@
               <w:rPr>
                 <w:sz w:val="14"/>
               </w:rPr>
-              <w:t>0937</w:t>
+              <w:t>{Sdtchure}</w:t>
+            </w:r>
+            <w:r>
+              <w:rPr>
+                <w:spacing w:val="6"/>
+                <w:sz w:val="14"/>
+              </w:rPr>
+              <w:t> </w:t>
+            </w:r>
+            <w:r>
+              <w:rPr>
+                <w:sz w:val="14"/>
+              </w:rPr>
+              <w:t>(CR)</w:t>
             </w:r>
             <w:r>
               <w:rPr>
@@ -1268,45 +1106,6 @@
               <w:rPr>
                 <w:sz w:val="14"/>
               </w:rPr>
-              <w:t>260</w:t>
-            </w:r>
-            <w:r>
-              <w:rPr>
-                <w:spacing w:val="5"/>
-                <w:sz w:val="14"/>
-              </w:rPr>
-              <w:t> </w:t>
-            </w:r>
-            <w:r>
-              <w:rPr>
-                <w:sz w:val="14"/>
-              </w:rPr>
-              <w:t>013</w:t>
-            </w:r>
-            <w:r>
-              <w:rPr>
-                <w:spacing w:val="6"/>
-                <w:sz w:val="14"/>
-              </w:rPr>
-              <w:t> </w:t>
-            </w:r>
-            <w:r>
-              <w:rPr>
-                <w:sz w:val="14"/>
-              </w:rPr>
-              <w:t>(CR)</w:t>
-            </w:r>
-            <w:r>
-              <w:rPr>
-                <w:spacing w:val="5"/>
-                <w:sz w:val="14"/>
-              </w:rPr>
-              <w:t> </w:t>
-            </w:r>
-            <w:r>
-              <w:rPr>
-                <w:sz w:val="14"/>
-              </w:rPr>
               <w:t>-</w:t>
             </w:r>
             <w:r>
@@ -1320,33 +1119,7 @@
               <w:rPr>
                 <w:sz w:val="14"/>
               </w:rPr>
-              <w:t>0398</w:t>
-            </w:r>
-            <w:r>
-              <w:rPr>
-                <w:spacing w:val="5"/>
-                <w:sz w:val="14"/>
-              </w:rPr>
-              <w:t> </w:t>
-            </w:r>
-            <w:r>
-              <w:rPr>
-                <w:sz w:val="14"/>
-              </w:rPr>
-              <w:t>401</w:t>
-            </w:r>
-            <w:r>
-              <w:rPr>
-                <w:spacing w:val="6"/>
-                <w:sz w:val="14"/>
-              </w:rPr>
-              <w:t> </w:t>
-            </w:r>
-            <w:r>
-              <w:rPr>
-                <w:sz w:val="14"/>
-              </w:rPr>
-              <w:t>671</w:t>
+              <w:t>{Sdtcodau}</w:t>
             </w:r>
             <w:r>
               <w:rPr>
@@ -1497,7 +1270,7 @@
                 <w:spacing w:val="-2"/>
                 <w:sz w:val="14"/>
               </w:rPr>
-              <w:t>Fanpage</w:t>
+              <w:t>{DoiTuongKhach}</w:t>
             </w:r>
           </w:p>
         </w:tc>
@@ -1803,742 +1576,8 @@
             </w:tcBorders>
           </w:tcPr>
           <w:p>
-            <w:pPr>
-              <w:pStyle w:val="TableParagraph"/>
-              <w:spacing w:line="264" w:lineRule="auto" w:before="7"/>
-              <w:ind w:left="22" w:right="857"/>
-              <w:rPr>
-                <w:sz w:val="14"/>
-              </w:rPr>
-            </w:pPr>
-            <w:r>
-              <w:rPr>
-                <w:sz w:val="14"/>
-              </w:rPr>
-              <w:t>Trang trí sảnh tiệc tiêu chuẩn, bao gồm:</w:t>
-            </w:r>
-            <w:r>
-              <w:rPr>
-                <w:spacing w:val="40"/>
-                <w:sz w:val="14"/>
-              </w:rPr>
-              <w:t> </w:t>
-            </w:r>
-            <w:r>
-              <w:rPr>
-                <w:sz w:val="14"/>
-              </w:rPr>
-              <w:t>Bảng thông tin đón khách tại cổng chính</w:t>
-            </w:r>
-            <w:r>
-              <w:rPr>
-                <w:spacing w:val="40"/>
-                <w:sz w:val="14"/>
-              </w:rPr>
-              <w:t> </w:t>
-            </w:r>
-            <w:r>
-              <w:rPr>
-                <w:sz w:val="14"/>
-              </w:rPr>
-              <w:t>Sân khấu tiêu chuẩn (9.6m x 3.6m x 0.8m)</w:t>
-            </w:r>
-            <w:r>
-              <w:rPr>
-                <w:spacing w:val="40"/>
-                <w:sz w:val="14"/>
-              </w:rPr>
-              <w:t> </w:t>
-            </w:r>
-            <w:r>
-              <w:rPr>
-                <w:sz w:val="14"/>
-              </w:rPr>
-              <w:t>Hệ thống âm thanh - ánh sáng tiêu chuẩn</w:t>
-            </w:r>
-            <w:r>
-              <w:rPr>
-                <w:spacing w:val="40"/>
-                <w:sz w:val="14"/>
-              </w:rPr>
-              <w:t> </w:t>
-            </w:r>
-            <w:r>
-              <w:rPr>
-                <w:sz w:val="14"/>
-              </w:rPr>
-              <w:t>Catwalk theo kích thước tiêu chuẩn</w:t>
-            </w:r>
-          </w:p>
-          <w:p>
-            <w:pPr>
-              <w:pStyle w:val="TableParagraph"/>
-              <w:spacing w:line="266" w:lineRule="auto" w:before="2"/>
-              <w:ind w:left="22" w:right="423"/>
-              <w:jc w:val="both"/>
-              <w:rPr>
-                <w:sz w:val="14"/>
-              </w:rPr>
-            </w:pPr>
-            <w:r>
-              <w:rPr>
-                <w:sz w:val="14"/>
-              </w:rPr>
-              <w:t>Phông màn sân khấu tiêu chuẩn (Màn voan trắng)</w:t>
-            </w:r>
-            <w:r>
-              <w:rPr>
-                <w:spacing w:val="40"/>
-                <w:sz w:val="14"/>
-              </w:rPr>
-              <w:t> </w:t>
-            </w:r>
-            <w:r>
-              <w:rPr>
-                <w:sz w:val="14"/>
-              </w:rPr>
-              <w:t>Thùng đựng tiền mừng, liễn ký tên lưu niệm + bút</w:t>
-            </w:r>
-            <w:r>
-              <w:rPr>
-                <w:spacing w:val="40"/>
-                <w:sz w:val="14"/>
-              </w:rPr>
-              <w:t> </w:t>
-            </w:r>
-            <w:r>
-              <w:rPr>
-                <w:sz w:val="14"/>
-              </w:rPr>
-              <w:t>Phòng trang điểm CD-CR.</w:t>
-            </w:r>
-          </w:p>
-          <w:p>
-            <w:pPr>
-              <w:pStyle w:val="TableParagraph"/>
-              <w:spacing w:line="158" w:lineRule="exact"/>
-              <w:ind w:left="22"/>
-              <w:jc w:val="both"/>
-              <w:rPr>
-                <w:sz w:val="14"/>
-              </w:rPr>
-            </w:pPr>
-            <w:r>
-              <w:rPr>
-                <w:sz w:val="14"/>
-              </w:rPr>
-              <w:t>Lễ</w:t>
-            </w:r>
-            <w:r>
-              <w:rPr>
-                <w:spacing w:val="3"/>
-                <w:sz w:val="14"/>
-              </w:rPr>
-              <w:t> </w:t>
-            </w:r>
-            <w:r>
-              <w:rPr>
-                <w:sz w:val="14"/>
-              </w:rPr>
-              <w:t>tân</w:t>
-            </w:r>
-            <w:r>
-              <w:rPr>
-                <w:spacing w:val="4"/>
-                <w:sz w:val="14"/>
-              </w:rPr>
-              <w:t> </w:t>
-            </w:r>
-            <w:r>
-              <w:rPr>
-                <w:sz w:val="14"/>
-              </w:rPr>
-              <w:t>hướng</w:t>
-            </w:r>
-            <w:r>
-              <w:rPr>
-                <w:spacing w:val="1"/>
-                <w:sz w:val="14"/>
-              </w:rPr>
-              <w:t> </w:t>
-            </w:r>
-            <w:r>
-              <w:rPr>
-                <w:sz w:val="14"/>
-              </w:rPr>
-              <w:t>dẫn</w:t>
-            </w:r>
-            <w:r>
-              <w:rPr>
-                <w:spacing w:val="4"/>
-                <w:sz w:val="14"/>
-              </w:rPr>
-              <w:t> </w:t>
-            </w:r>
-            <w:r>
-              <w:rPr>
-                <w:spacing w:val="-2"/>
-                <w:sz w:val="14"/>
-              </w:rPr>
-              <w:t>khách.</w:t>
-            </w:r>
-          </w:p>
-          <w:p>
-            <w:pPr>
-              <w:pStyle w:val="TableParagraph"/>
-              <w:spacing w:line="264" w:lineRule="auto" w:before="17"/>
-              <w:ind w:left="22" w:right="183"/>
-              <w:rPr>
-                <w:sz w:val="14"/>
-              </w:rPr>
-            </w:pPr>
-            <w:r>
-              <w:rPr>
-                <w:sz w:val="14"/>
-              </w:rPr>
-              <w:t>Trang trí bục lối đi lên sân khấu (gồm: hoa thạch thảo</w:t>
-            </w:r>
-            <w:r>
-              <w:rPr>
-                <w:spacing w:val="40"/>
-                <w:sz w:val="14"/>
-              </w:rPr>
-              <w:t> </w:t>
-            </w:r>
-            <w:r>
-              <w:rPr>
-                <w:sz w:val="14"/>
-              </w:rPr>
-              <w:t>trắng + đèn tuyết)</w:t>
-            </w:r>
-          </w:p>
-          <w:p>
-            <w:pPr>
-              <w:pStyle w:val="TableParagraph"/>
-              <w:spacing w:line="264" w:lineRule="auto" w:before="1"/>
-              <w:ind w:left="22" w:right="183"/>
-              <w:rPr>
-                <w:sz w:val="14"/>
-              </w:rPr>
-            </w:pPr>
-            <w:r>
-              <w:rPr>
-                <w:sz w:val="14"/>
-              </w:rPr>
-              <w:t>Ăn nhẹ trước tiệc cho Bố Mẹ, CD &amp; CR (10 người)</w:t>
-            </w:r>
-            <w:r>
-              <w:rPr>
-                <w:spacing w:val="40"/>
-                <w:sz w:val="14"/>
-              </w:rPr>
-              <w:t> </w:t>
-            </w:r>
-            <w:r>
-              <w:rPr>
-                <w:sz w:val="14"/>
-              </w:rPr>
-              <w:t>Pháo hoa kim tuyến 02 lần (01 lần/ 02 viên)</w:t>
-            </w:r>
-          </w:p>
-          <w:p>
-            <w:pPr>
-              <w:pStyle w:val="TableParagraph"/>
-              <w:spacing w:before="6"/>
-              <w:ind w:left="22"/>
-              <w:rPr>
-                <w:b/>
-                <w:sz w:val="14"/>
-              </w:rPr>
-            </w:pPr>
-            <w:r>
-              <w:rPr>
-                <w:b/>
-                <w:sz w:val="14"/>
-              </w:rPr>
-              <w:t>MC</w:t>
-            </w:r>
-            <w:r>
-              <w:rPr>
-                <w:b/>
-                <w:spacing w:val="3"/>
-                <w:sz w:val="14"/>
-              </w:rPr>
-              <w:t> </w:t>
-            </w:r>
-            <w:r>
-              <w:rPr>
-                <w:b/>
-                <w:sz w:val="14"/>
-              </w:rPr>
-              <w:t>suốt</w:t>
-            </w:r>
-            <w:r>
-              <w:rPr>
-                <w:b/>
-                <w:spacing w:val="5"/>
-                <w:sz w:val="14"/>
-              </w:rPr>
-              <w:t> </w:t>
-            </w:r>
-            <w:r>
-              <w:rPr>
-                <w:b/>
-                <w:sz w:val="14"/>
-              </w:rPr>
-              <w:t>tiệc</w:t>
-            </w:r>
-            <w:r>
-              <w:rPr>
-                <w:b/>
-                <w:spacing w:val="4"/>
-                <w:sz w:val="14"/>
-              </w:rPr>
-              <w:t> </w:t>
-            </w:r>
-            <w:r>
-              <w:rPr>
-                <w:b/>
-                <w:sz w:val="14"/>
-              </w:rPr>
-              <w:t>(Tiếng</w:t>
-            </w:r>
-            <w:r>
-              <w:rPr>
-                <w:b/>
-                <w:spacing w:val="5"/>
-                <w:sz w:val="14"/>
-              </w:rPr>
-              <w:t> </w:t>
-            </w:r>
-            <w:r>
-              <w:rPr>
-                <w:b/>
-                <w:sz w:val="14"/>
-              </w:rPr>
-              <w:t>Việt)</w:t>
-            </w:r>
-            <w:r>
-              <w:rPr>
-                <w:sz w:val="14"/>
-              </w:rPr>
-              <w:t>,</w:t>
-            </w:r>
-            <w:r>
-              <w:rPr>
-                <w:spacing w:val="4"/>
-                <w:sz w:val="14"/>
-              </w:rPr>
-              <w:t> </w:t>
-            </w:r>
-            <w:r>
-              <w:rPr>
-                <w:b/>
-                <w:sz w:val="14"/>
-              </w:rPr>
-              <w:t>bù</w:t>
-            </w:r>
-            <w:r>
-              <w:rPr>
-                <w:b/>
-                <w:spacing w:val="4"/>
-                <w:sz w:val="14"/>
-              </w:rPr>
-              <w:t> </w:t>
-            </w:r>
-            <w:r>
-              <w:rPr>
-                <w:b/>
-                <w:spacing w:val="-5"/>
-                <w:sz w:val="14"/>
-              </w:rPr>
-              <w:t>phí</w:t>
-            </w:r>
-          </w:p>
-          <w:p>
-            <w:pPr>
-              <w:pStyle w:val="TableParagraph"/>
-              <w:spacing w:before="16"/>
-              <w:ind w:left="22"/>
-              <w:rPr>
-                <w:sz w:val="14"/>
-              </w:rPr>
-            </w:pPr>
-            <w:r>
-              <w:rPr>
-                <w:sz w:val="14"/>
-              </w:rPr>
-              <w:t>Trang</w:t>
-            </w:r>
-            <w:r>
-              <w:rPr>
-                <w:spacing w:val="2"/>
-                <w:sz w:val="14"/>
-              </w:rPr>
-              <w:t> </w:t>
-            </w:r>
-            <w:r>
-              <w:rPr>
-                <w:sz w:val="14"/>
-              </w:rPr>
-              <w:t>trí</w:t>
-            </w:r>
-            <w:r>
-              <w:rPr>
-                <w:spacing w:val="5"/>
-                <w:sz w:val="14"/>
-              </w:rPr>
-              <w:t> </w:t>
-            </w:r>
-            <w:r>
-              <w:rPr>
-                <w:sz w:val="14"/>
-              </w:rPr>
-              <w:t>hoa</w:t>
-            </w:r>
-            <w:r>
-              <w:rPr>
-                <w:spacing w:val="6"/>
-                <w:sz w:val="14"/>
-              </w:rPr>
-              <w:t> </w:t>
-            </w:r>
-            <w:r>
-              <w:rPr>
-                <w:sz w:val="14"/>
-              </w:rPr>
-              <w:t>tươi</w:t>
-            </w:r>
-            <w:r>
-              <w:rPr>
-                <w:spacing w:val="6"/>
-                <w:sz w:val="14"/>
-              </w:rPr>
-              <w:t> </w:t>
-            </w:r>
-            <w:r>
-              <w:rPr>
-                <w:sz w:val="14"/>
-              </w:rPr>
-              <w:t>tháp</w:t>
-            </w:r>
-            <w:r>
-              <w:rPr>
-                <w:spacing w:val="5"/>
-                <w:sz w:val="14"/>
-              </w:rPr>
-              <w:t> </w:t>
-            </w:r>
-            <w:r>
-              <w:rPr>
-                <w:sz w:val="14"/>
-              </w:rPr>
-              <w:t>bánh,</w:t>
-            </w:r>
-            <w:r>
-              <w:rPr>
-                <w:spacing w:val="6"/>
-                <w:sz w:val="14"/>
-              </w:rPr>
-              <w:t> </w:t>
-            </w:r>
-            <w:r>
-              <w:rPr>
-                <w:sz w:val="14"/>
-              </w:rPr>
-              <w:t>tháp</w:t>
-            </w:r>
-            <w:r>
-              <w:rPr>
-                <w:spacing w:val="6"/>
-                <w:sz w:val="14"/>
-              </w:rPr>
-              <w:t> </w:t>
-            </w:r>
-            <w:r>
-              <w:rPr>
-                <w:sz w:val="14"/>
-              </w:rPr>
-              <w:t>ly tiêu</w:t>
-            </w:r>
-            <w:r>
-              <w:rPr>
-                <w:spacing w:val="5"/>
-                <w:sz w:val="14"/>
-              </w:rPr>
-              <w:t> </w:t>
-            </w:r>
-            <w:r>
-              <w:rPr>
-                <w:spacing w:val="-2"/>
-                <w:sz w:val="14"/>
-              </w:rPr>
-              <w:t>chuẩn</w:t>
-            </w:r>
-          </w:p>
-          <w:p>
-            <w:pPr>
-              <w:pStyle w:val="TableParagraph"/>
-              <w:spacing w:line="264" w:lineRule="auto" w:before="22"/>
-              <w:ind w:left="22" w:right="183"/>
-              <w:rPr>
-                <w:sz w:val="14"/>
-              </w:rPr>
-            </w:pPr>
-            <w:r>
-              <w:rPr>
-                <w:sz w:val="14"/>
-              </w:rPr>
-              <w:t>Trang trí hoa tươi bàn tiệc tiêu chuẩn </w:t>
-            </w:r>
-            <w:r>
-              <w:rPr>
-                <w:b/>
-                <w:sz w:val="14"/>
-              </w:rPr>
-              <w:t>(Tone trắng)</w:t>
-            </w:r>
-            <w:r>
-              <w:rPr>
-                <w:b/>
-                <w:spacing w:val="40"/>
-                <w:sz w:val="14"/>
-              </w:rPr>
-              <w:t> </w:t>
-            </w:r>
-            <w:r>
-              <w:rPr>
-                <w:sz w:val="14"/>
-              </w:rPr>
-              <w:t>Tháp ly và 02 chai champage, đá khói</w:t>
-            </w:r>
-          </w:p>
-          <w:p>
-            <w:pPr>
-              <w:pStyle w:val="TableParagraph"/>
-              <w:spacing w:line="271" w:lineRule="auto" w:before="6"/>
-              <w:ind w:left="22" w:right="183"/>
-              <w:rPr>
-                <w:b/>
-                <w:sz w:val="14"/>
-              </w:rPr>
-            </w:pPr>
-            <w:r>
-              <w:rPr>
-                <w:sz w:val="14"/>
-              </w:rPr>
-              <w:t>Bánh cưới 05 tầng và trang trí tiêu chuẩn. </w:t>
-            </w:r>
-            <w:r>
-              <w:rPr>
-                <w:b/>
-                <w:sz w:val="14"/>
-              </w:rPr>
-              <w:t>(Tặng bánh</w:t>
-            </w:r>
-            <w:r>
-              <w:rPr>
-                <w:b/>
-                <w:spacing w:val="40"/>
-                <w:sz w:val="14"/>
-              </w:rPr>
-              <w:t> </w:t>
-            </w:r>
-            <w:r>
-              <w:rPr>
-                <w:b/>
-                <w:spacing w:val="-2"/>
-                <w:sz w:val="14"/>
-              </w:rPr>
-              <w:t>thật)</w:t>
-            </w:r>
-          </w:p>
-          <w:p>
-            <w:pPr>
-              <w:pStyle w:val="TableParagraph"/>
-              <w:spacing w:line="271" w:lineRule="auto"/>
-              <w:ind w:left="22" w:right="183"/>
-              <w:rPr>
-                <w:b/>
-                <w:sz w:val="14"/>
-              </w:rPr>
-            </w:pPr>
-            <w:r>
-              <w:rPr>
-                <w:sz w:val="14"/>
-              </w:rPr>
-              <w:t>Múa đôi khai lễ </w:t>
-            </w:r>
-            <w:r>
-              <w:rPr>
-                <w:b/>
-                <w:sz w:val="14"/>
-              </w:rPr>
-              <w:t>(Bài When you tell me that you love</w:t>
-            </w:r>
-            <w:r>
-              <w:rPr>
-                <w:b/>
-                <w:spacing w:val="40"/>
-                <w:sz w:val="14"/>
-              </w:rPr>
-              <w:t> </w:t>
-            </w:r>
-            <w:r>
-              <w:rPr>
-                <w:b/>
-                <w:spacing w:val="-4"/>
-                <w:sz w:val="14"/>
-              </w:rPr>
-              <w:t>me)</w:t>
-            </w:r>
-          </w:p>
-          <w:p>
-            <w:pPr>
-              <w:pStyle w:val="TableParagraph"/>
-              <w:spacing w:line="157" w:lineRule="exact"/>
-              <w:ind w:left="22"/>
-              <w:rPr>
-                <w:sz w:val="14"/>
-              </w:rPr>
-            </w:pPr>
-            <w:r>
-              <w:rPr>
-                <w:sz w:val="14"/>
-              </w:rPr>
-              <w:t>Màn</w:t>
-            </w:r>
-            <w:r>
-              <w:rPr>
-                <w:spacing w:val="4"/>
-                <w:sz w:val="14"/>
-              </w:rPr>
-              <w:t> </w:t>
-            </w:r>
-            <w:r>
-              <w:rPr>
-                <w:sz w:val="14"/>
-              </w:rPr>
-              <w:t>hình</w:t>
-            </w:r>
-            <w:r>
-              <w:rPr>
-                <w:spacing w:val="4"/>
-                <w:sz w:val="14"/>
-              </w:rPr>
-              <w:t> </w:t>
-            </w:r>
-            <w:r>
-              <w:rPr>
-                <w:sz w:val="14"/>
-              </w:rPr>
-              <w:t>LED</w:t>
-            </w:r>
-            <w:r>
-              <w:rPr>
-                <w:spacing w:val="3"/>
-                <w:sz w:val="14"/>
-              </w:rPr>
-              <w:t> </w:t>
-            </w:r>
-            <w:r>
-              <w:rPr>
-                <w:sz w:val="14"/>
-              </w:rPr>
-              <w:t>suốt</w:t>
-            </w:r>
-            <w:r>
-              <w:rPr>
-                <w:spacing w:val="4"/>
-                <w:sz w:val="14"/>
-              </w:rPr>
-              <w:t> </w:t>
-            </w:r>
-            <w:r>
-              <w:rPr>
-                <w:sz w:val="14"/>
-              </w:rPr>
-              <w:t>tiệc</w:t>
-            </w:r>
-            <w:r>
-              <w:rPr>
-                <w:spacing w:val="4"/>
-                <w:sz w:val="14"/>
-              </w:rPr>
-              <w:t> </w:t>
-            </w:r>
-            <w:r>
-              <w:rPr>
-                <w:spacing w:val="-2"/>
-                <w:sz w:val="14"/>
-              </w:rPr>
-              <w:t>(12m2)</w:t>
-            </w:r>
-          </w:p>
-          <w:p>
-            <w:pPr>
-              <w:pStyle w:val="TableParagraph"/>
-              <w:spacing w:line="264" w:lineRule="auto" w:before="12"/>
-              <w:ind w:left="22" w:right="599"/>
-              <w:rPr>
-                <w:sz w:val="14"/>
-              </w:rPr>
-            </w:pPr>
-            <w:r>
-              <w:rPr>
-                <w:sz w:val="14"/>
-              </w:rPr>
-              <w:t>Ban nhạc điện tử 04 nhạc công (19h30-21h30)</w:t>
-            </w:r>
-            <w:r>
-              <w:rPr>
-                <w:spacing w:val="40"/>
-                <w:sz w:val="14"/>
-              </w:rPr>
-              <w:t> </w:t>
-            </w:r>
-            <w:r>
-              <w:rPr>
-                <w:sz w:val="14"/>
-              </w:rPr>
-              <w:t>01 ca sỹ hát 02 bài</w:t>
-            </w:r>
-          </w:p>
-          <w:p>
-            <w:pPr>
-              <w:pStyle w:val="TableParagraph"/>
-              <w:spacing w:line="273" w:lineRule="auto" w:before="2"/>
-              <w:ind w:left="22" w:right="183"/>
-              <w:rPr>
-                <w:b/>
-                <w:sz w:val="14"/>
-              </w:rPr>
-            </w:pPr>
-            <w:r>
-              <w:rPr>
-                <w:sz w:val="14"/>
-              </w:rPr>
-              <w:t>Backdrop và bàn Gallery hoa tươi mẫu CITY 151 (Đối</w:t>
-            </w:r>
-            <w:r>
-              <w:rPr>
-                <w:spacing w:val="40"/>
-                <w:sz w:val="14"/>
-              </w:rPr>
-              <w:t> </w:t>
-            </w:r>
-            <w:r>
-              <w:rPr>
-                <w:sz w:val="14"/>
-              </w:rPr>
-              <w:t>tác City) </w:t>
-            </w:r>
-            <w:r>
-              <w:rPr>
-                <w:b/>
-                <w:sz w:val="14"/>
-              </w:rPr>
-              <w:t>(Tone trắng - hồng pastel)</w:t>
+            <w:r>
+              <w:t>{DichVuKhuyenMai}</w:t>
             </w:r>
           </w:p>
         </w:tc>
@@ -2727,7 +1766,7 @@
                 <w:spacing w:val="-2"/>
                 <w:sz w:val="14"/>
               </w:rPr>
-              <w:t>17h00</w:t>
+              <w:t>{GioBatDau}</w:t>
             </w:r>
           </w:p>
         </w:tc>
@@ -2755,7 +1794,7 @@
                 <w:spacing w:val="-2"/>
                 <w:sz w:val="14"/>
               </w:rPr>
-              <w:t>22h00</w:t>
+              <w:t>{GioKetThuc}</w:t>
             </w:r>
           </w:p>
         </w:tc>
@@ -2784,23 +1823,7 @@
                 <w:b/>
                 <w:sz w:val="14"/>
               </w:rPr>
-              <w:t>QUEEN</w:t>
-            </w:r>
-            <w:r>
-              <w:rPr>
-                <w:b/>
-                <w:spacing w:val="4"/>
-                <w:sz w:val="14"/>
-              </w:rPr>
-              <w:t> </w:t>
-            </w:r>
-            <w:r>
-              <w:rPr>
-                <w:b/>
-                <w:spacing w:val="-2"/>
-                <w:sz w:val="14"/>
-              </w:rPr>
-              <w:t>02+03</w:t>
+              <w:t>{SanhDat}</w:t>
             </w:r>
           </w:p>
         </w:tc>
@@ -3053,73 +2076,7 @@
               <w:rPr>
                 <w:sz w:val="14"/>
               </w:rPr>
-              <w:t>36</w:t>
-            </w:r>
-            <w:r>
-              <w:rPr>
-                <w:spacing w:val="4"/>
-                <w:sz w:val="14"/>
-              </w:rPr>
-              <w:t> </w:t>
-            </w:r>
-            <w:r>
-              <w:rPr>
-                <w:sz w:val="14"/>
-              </w:rPr>
-              <w:t>bàn</w:t>
-            </w:r>
-            <w:r>
-              <w:rPr>
-                <w:spacing w:val="4"/>
-                <w:sz w:val="14"/>
-              </w:rPr>
-              <w:t> </w:t>
-            </w:r>
-            <w:r>
-              <w:rPr>
-                <w:sz w:val="14"/>
-              </w:rPr>
-              <w:t>mặn</w:t>
-            </w:r>
-            <w:r>
-              <w:rPr>
-                <w:spacing w:val="4"/>
-                <w:sz w:val="14"/>
-              </w:rPr>
-              <w:t> </w:t>
-            </w:r>
-            <w:r>
-              <w:rPr>
-                <w:sz w:val="14"/>
-              </w:rPr>
-              <w:t>/</w:t>
-            </w:r>
-            <w:r>
-              <w:rPr>
-                <w:spacing w:val="2"/>
-                <w:sz w:val="14"/>
-              </w:rPr>
-              <w:t> </w:t>
-            </w:r>
-            <w:r>
-              <w:rPr>
-                <w:sz w:val="14"/>
-              </w:rPr>
-              <w:t>10</w:t>
-            </w:r>
-            <w:r>
-              <w:rPr>
-                <w:spacing w:val="4"/>
-                <w:sz w:val="14"/>
-              </w:rPr>
-              <w:t> </w:t>
-            </w:r>
-            <w:r>
-              <w:rPr>
-                <w:spacing w:val="-2"/>
-                <w:sz w:val="14"/>
-              </w:rPr>
-              <w:t>khách</w:t>
+              <w:t>{SobanManchinhthuc} bàn mặn / 10 khách</w:t>
             </w:r>
           </w:p>
         </w:tc>
@@ -3154,47 +2111,7 @@
               <w:rPr>
                 <w:sz w:val="14"/>
               </w:rPr>
-              <w:t>02</w:t>
-            </w:r>
-            <w:r>
-              <w:rPr>
-                <w:spacing w:val="4"/>
-                <w:sz w:val="14"/>
-              </w:rPr>
-              <w:t> </w:t>
-            </w:r>
-            <w:r>
-              <w:rPr>
-                <w:sz w:val="14"/>
-              </w:rPr>
-              <w:t>bàn/</w:t>
-            </w:r>
-            <w:r>
-              <w:rPr>
-                <w:spacing w:val="2"/>
-                <w:sz w:val="14"/>
-              </w:rPr>
-              <w:t> </w:t>
-            </w:r>
-            <w:r>
-              <w:rPr>
-                <w:sz w:val="14"/>
-              </w:rPr>
-              <w:t>10</w:t>
-            </w:r>
-            <w:r>
-              <w:rPr>
-                <w:spacing w:val="5"/>
-                <w:sz w:val="14"/>
-              </w:rPr>
-              <w:t> </w:t>
-            </w:r>
-            <w:r>
-              <w:rPr>
-                <w:spacing w:val="-2"/>
-                <w:sz w:val="14"/>
-              </w:rPr>
-              <w:t>khách</w:t>
+              <w:t>{SobanManduphong} bàn/ 10 khách</w:t>
             </w:r>
           </w:p>
         </w:tc>
@@ -3268,47 +2185,7 @@
               <w:rPr>
                 <w:sz w:val="14"/>
               </w:rPr>
-              <w:t>Ghế</w:t>
-            </w:r>
-            <w:r>
-              <w:rPr>
-                <w:spacing w:val="3"/>
-                <w:sz w:val="14"/>
-              </w:rPr>
-              <w:t> </w:t>
-            </w:r>
-            <w:r>
-              <w:rPr>
-                <w:sz w:val="14"/>
-              </w:rPr>
-              <w:t>trắng -</w:t>
-            </w:r>
-            <w:r>
-              <w:rPr>
-                <w:spacing w:val="1"/>
-                <w:sz w:val="14"/>
-              </w:rPr>
-              <w:t> </w:t>
-            </w:r>
-            <w:r>
-              <w:rPr>
-                <w:sz w:val="14"/>
-              </w:rPr>
-              <w:t>Nơ</w:t>
-            </w:r>
-            <w:r>
-              <w:rPr>
-                <w:spacing w:val="3"/>
-                <w:sz w:val="14"/>
-              </w:rPr>
-              <w:t> </w:t>
-            </w:r>
-            <w:r>
-              <w:rPr>
-                <w:spacing w:val="-4"/>
-                <w:sz w:val="14"/>
-              </w:rPr>
-              <w:t>hồng</w:t>
+              <w:t>{SetupNoGhe}</w:t>
             </w:r>
           </w:p>
         </w:tc>
@@ -3466,441 +2343,68 @@
           <w:p>
             <w:pPr>
               <w:pStyle w:val="TableParagraph"/>
-              <w:spacing w:line="264" w:lineRule="auto" w:before="12"/>
-              <w:ind w:left="22" w:right="560"/>
-              <w:rPr>
-                <w:b/>
-                <w:sz w:val="14"/>
-              </w:rPr>
-            </w:pPr>
-            <w:r>
-              <w:rPr>
-                <w:b/>
-                <w:sz w:val="14"/>
-              </w:rPr>
-              <w:t>Ăn nhẹ cho bố mẹ, CD&amp;CR (Súp +cơm): 10 người</w:t>
-            </w:r>
-            <w:r>
-              <w:rPr>
-                <w:b/>
-                <w:spacing w:val="40"/>
-                <w:sz w:val="14"/>
-              </w:rPr>
-              <w:t> </w:t>
-            </w:r>
-            <w:r>
-              <w:rPr>
-                <w:b/>
-                <w:sz w:val="14"/>
-              </w:rPr>
-              <w:t>Bánh mặn : Bánh Danish Ham</w:t>
-            </w:r>
-            <w:r>
-              <w:rPr>
-                <w:b/>
-                <w:spacing w:val="-1"/>
-                <w:sz w:val="14"/>
-              </w:rPr>
-              <w:t> </w:t>
-            </w:r>
-            <w:r>
-              <w:rPr>
-                <w:b/>
-                <w:sz w:val="14"/>
-              </w:rPr>
-              <w:t>Cheese đầu giờ: 36 bàn</w:t>
-            </w:r>
-            <w:r>
-              <w:rPr>
-                <w:b/>
-                <w:spacing w:val="40"/>
-                <w:sz w:val="14"/>
-              </w:rPr>
-              <w:t> </w:t>
-            </w:r>
-            <w:r>
-              <w:rPr>
-                <w:b/>
-                <w:sz w:val="14"/>
-              </w:rPr>
-              <w:t>1/ Khai vị 02 món:</w:t>
-            </w:r>
-          </w:p>
-          <w:p>
-            <w:pPr>
-              <w:pStyle w:val="TableParagraph"/>
-              <w:spacing w:line="264" w:lineRule="auto" w:before="1"/>
-              <w:ind w:left="58" w:right="2417"/>
-              <w:rPr>
-                <w:b/>
-                <w:sz w:val="14"/>
-              </w:rPr>
-            </w:pPr>
-            <w:r>
-              <w:rPr>
-                <w:b/>
-                <w:sz w:val="14"/>
-              </w:rPr>
-              <w:t>Gỏi</w:t>
-            </w:r>
-            <w:r>
-              <w:rPr>
-                <w:b/>
-                <w:spacing w:val="-2"/>
-                <w:sz w:val="14"/>
-              </w:rPr>
-              <w:t> </w:t>
-            </w:r>
-            <w:r>
-              <w:rPr>
-                <w:b/>
-                <w:sz w:val="14"/>
-              </w:rPr>
-              <w:t>ngó</w:t>
-            </w:r>
-            <w:r>
-              <w:rPr>
-                <w:b/>
-                <w:spacing w:val="-2"/>
-                <w:sz w:val="14"/>
-              </w:rPr>
-              <w:t> </w:t>
-            </w:r>
-            <w:r>
-              <w:rPr>
-                <w:b/>
-                <w:sz w:val="14"/>
-              </w:rPr>
-              <w:t>sen</w:t>
-            </w:r>
-            <w:r>
-              <w:rPr>
-                <w:b/>
-                <w:spacing w:val="-3"/>
-                <w:sz w:val="14"/>
-              </w:rPr>
-              <w:t> </w:t>
-            </w:r>
-            <w:r>
-              <w:rPr>
-                <w:b/>
-                <w:sz w:val="14"/>
-              </w:rPr>
-              <w:t>tôm</w:t>
-            </w:r>
-            <w:r>
-              <w:rPr>
-                <w:b/>
-                <w:spacing w:val="-7"/>
-                <w:sz w:val="14"/>
-              </w:rPr>
-              <w:t> </w:t>
-            </w:r>
-            <w:r>
-              <w:rPr>
-                <w:b/>
-                <w:sz w:val="14"/>
-              </w:rPr>
-              <w:t>thịt</w:t>
-            </w:r>
-            <w:r>
-              <w:rPr>
-                <w:b/>
-                <w:spacing w:val="40"/>
-                <w:sz w:val="14"/>
-              </w:rPr>
-              <w:t> </w:t>
-            </w:r>
-            <w:r>
-              <w:rPr>
-                <w:b/>
-                <w:sz w:val="14"/>
-              </w:rPr>
-              <w:t>Chả ốc lá lốt</w:t>
-            </w:r>
-          </w:p>
-          <w:p>
-            <w:pPr>
-              <w:pStyle w:val="TableParagraph"/>
-              <w:spacing w:before="1"/>
-              <w:ind w:left="22"/>
-              <w:rPr>
-                <w:b/>
-                <w:sz w:val="14"/>
-              </w:rPr>
-            </w:pPr>
-            <w:r>
-              <w:rPr>
-                <w:b/>
-                <w:sz w:val="14"/>
-              </w:rPr>
-              <w:t>2/</w:t>
-            </w:r>
-            <w:r>
-              <w:rPr>
-                <w:b/>
-                <w:spacing w:val="3"/>
-                <w:sz w:val="14"/>
-              </w:rPr>
-              <w:t> </w:t>
-            </w:r>
-            <w:r>
-              <w:rPr>
-                <w:b/>
-                <w:sz w:val="14"/>
-              </w:rPr>
-              <w:t>Súp hải</w:t>
-            </w:r>
-            <w:r>
-              <w:rPr>
-                <w:b/>
-                <w:spacing w:val="3"/>
-                <w:sz w:val="14"/>
-              </w:rPr>
-              <w:t> </w:t>
-            </w:r>
-            <w:r>
-              <w:rPr>
-                <w:b/>
-                <w:sz w:val="14"/>
-              </w:rPr>
-              <w:t>sản</w:t>
-            </w:r>
-            <w:r>
-              <w:rPr>
-                <w:b/>
-                <w:spacing w:val="3"/>
-                <w:sz w:val="14"/>
-              </w:rPr>
-              <w:t> </w:t>
-            </w:r>
-            <w:r>
-              <w:rPr>
-                <w:b/>
-                <w:sz w:val="14"/>
-              </w:rPr>
-              <w:t>tóc</w:t>
-            </w:r>
-            <w:r>
-              <w:rPr>
-                <w:b/>
-                <w:spacing w:val="4"/>
-                <w:sz w:val="14"/>
-              </w:rPr>
-              <w:t> </w:t>
-            </w:r>
-            <w:r>
-              <w:rPr>
-                <w:b/>
-                <w:spacing w:val="-4"/>
-                <w:sz w:val="14"/>
-              </w:rPr>
-              <w:t>tiên</w:t>
-            </w:r>
-          </w:p>
-          <w:p>
-            <w:pPr>
-              <w:pStyle w:val="TableParagraph"/>
-              <w:spacing w:line="264" w:lineRule="auto" w:before="17"/>
-              <w:ind w:left="22" w:right="1255"/>
-              <w:rPr>
-                <w:b/>
-                <w:sz w:val="14"/>
-              </w:rPr>
-            </w:pPr>
-            <w:r>
-              <w:rPr>
-                <w:b/>
-                <w:sz w:val="14"/>
-              </w:rPr>
-              <w:t>3/ Tôm</w:t>
-            </w:r>
-            <w:r>
-              <w:rPr>
-                <w:b/>
-                <w:spacing w:val="-3"/>
-                <w:sz w:val="14"/>
-              </w:rPr>
-              <w:t> </w:t>
-            </w:r>
-            <w:r>
-              <w:rPr>
-                <w:b/>
-                <w:sz w:val="14"/>
-              </w:rPr>
-              <w:t>sú rang muối Hong Kong - Xà lách</w:t>
-            </w:r>
-            <w:r>
-              <w:rPr>
-                <w:b/>
-                <w:spacing w:val="40"/>
-                <w:sz w:val="14"/>
-              </w:rPr>
-              <w:t> </w:t>
-            </w:r>
-            <w:r>
-              <w:rPr>
-                <w:b/>
-                <w:sz w:val="14"/>
-              </w:rPr>
-              <w:t>4/ Rau củ xào X.O</w:t>
-            </w:r>
-          </w:p>
-          <w:p>
-            <w:pPr>
-              <w:pStyle w:val="TableParagraph"/>
-              <w:spacing w:before="1"/>
-              <w:ind w:left="22"/>
-              <w:rPr>
-                <w:b/>
-                <w:sz w:val="14"/>
-              </w:rPr>
-            </w:pPr>
-            <w:r>
-              <w:rPr>
-                <w:b/>
-                <w:sz w:val="14"/>
-              </w:rPr>
-              <w:t>5/</w:t>
-            </w:r>
-            <w:r>
-              <w:rPr>
-                <w:b/>
-                <w:spacing w:val="3"/>
-                <w:sz w:val="14"/>
-              </w:rPr>
-              <w:t> </w:t>
-            </w:r>
-            <w:r>
-              <w:rPr>
-                <w:b/>
-                <w:sz w:val="14"/>
-              </w:rPr>
-              <w:t>Bò</w:t>
-            </w:r>
-            <w:r>
-              <w:rPr>
-                <w:b/>
-                <w:spacing w:val="4"/>
-                <w:sz w:val="14"/>
-              </w:rPr>
-              <w:t> </w:t>
-            </w:r>
-            <w:r>
-              <w:rPr>
-                <w:b/>
-                <w:sz w:val="14"/>
-              </w:rPr>
-              <w:t>hầm</w:t>
-            </w:r>
-            <w:r>
-              <w:rPr>
-                <w:b/>
-                <w:spacing w:val="-1"/>
-                <w:sz w:val="14"/>
-              </w:rPr>
-              <w:t> </w:t>
-            </w:r>
-            <w:r>
-              <w:rPr>
-                <w:b/>
-                <w:sz w:val="14"/>
-              </w:rPr>
-              <w:t>tiêu</w:t>
-            </w:r>
-            <w:r>
-              <w:rPr>
-                <w:b/>
-                <w:spacing w:val="3"/>
-                <w:sz w:val="14"/>
-              </w:rPr>
-              <w:t> </w:t>
-            </w:r>
-            <w:r>
-              <w:rPr>
-                <w:b/>
-                <w:sz w:val="14"/>
-              </w:rPr>
-              <w:t>xanh</w:t>
-            </w:r>
-            <w:r>
-              <w:rPr>
-                <w:b/>
-                <w:spacing w:val="2"/>
-                <w:sz w:val="14"/>
-              </w:rPr>
-              <w:t> </w:t>
-            </w:r>
-            <w:r>
-              <w:rPr>
-                <w:b/>
-                <w:sz w:val="14"/>
-              </w:rPr>
-              <w:t>-</w:t>
-            </w:r>
-            <w:r>
-              <w:rPr>
-                <w:b/>
-                <w:spacing w:val="4"/>
-                <w:sz w:val="14"/>
-              </w:rPr>
-              <w:t> </w:t>
-            </w:r>
-            <w:r>
-              <w:rPr>
-                <w:b/>
-                <w:sz w:val="14"/>
-              </w:rPr>
-              <w:t>Bánh</w:t>
-            </w:r>
-            <w:r>
-              <w:rPr>
-                <w:b/>
-                <w:spacing w:val="3"/>
-                <w:sz w:val="14"/>
-              </w:rPr>
-              <w:t> </w:t>
-            </w:r>
-            <w:r>
-              <w:rPr>
-                <w:b/>
-                <w:spacing w:val="-5"/>
-                <w:sz w:val="14"/>
-              </w:rPr>
-              <w:t>mì</w:t>
-            </w:r>
-          </w:p>
-          <w:p>
-            <w:pPr>
-              <w:pStyle w:val="TableParagraph"/>
-              <w:spacing w:line="264" w:lineRule="auto" w:before="16"/>
-              <w:ind w:left="22" w:right="1709"/>
-              <w:rPr>
-                <w:b/>
-                <w:sz w:val="14"/>
-              </w:rPr>
-            </w:pPr>
-            <w:r>
-              <w:rPr>
-                <w:b/>
-                <w:sz w:val="14"/>
-              </w:rPr>
-              <w:t>6/ Lẩu hải sản Thái Lan - Bún tươi</w:t>
-            </w:r>
-            <w:r>
-              <w:rPr>
-                <w:b/>
-                <w:spacing w:val="40"/>
-                <w:sz w:val="14"/>
-              </w:rPr>
-              <w:t> </w:t>
-            </w:r>
-            <w:r>
-              <w:rPr>
-                <w:b/>
-                <w:sz w:val="14"/>
-              </w:rPr>
-              <w:t>7/ Chè hạt sen long nhãn</w:t>
+            </w:pPr>
+            <w:r>
+              <w:rPr>
+                <w:sz w:val="10"/>
+              </w:rPr>
+              <w:t>{AnNheTruocTiec} Bánh mặn : {BanhManDauGio}</w:t>
+            </w:r>
+          </w:p>
+          <w:p>
+            <w:r>
+              <w:t>{#DanhSachMenu}</w:t>
+            </w:r>
+          </w:p>
+          <w:p>
+            <w:pPr>
+              <w:pStyle w:val="TableParagraph"/>
+            </w:pPr>
+            <w:r>
+              <w:rPr>
+                <w:b/>
+                <w:sz w:val="10"/>
+              </w:rPr>
+              <w:t>THỰC ĐƠN: {TenMenu}</w:t>
+            </w:r>
+          </w:p>
+          <w:p>
+            <w:r>
+              <w:t>{#DanhSachMon}</w:t>
+            </w:r>
+          </w:p>
+          <w:p>
+            <w:pPr>
+              <w:pStyle w:val="TableParagraph"/>
+            </w:pPr>
+            <w:r>
+              <w:rPr>
+                <w:sz w:val="10"/>
+              </w:rPr>
+              <w:t>{STT}. {TenMon}</w:t>
+            </w:r>
+          </w:p>
+          <w:p>
+            <w:r>
+              <w:t>{/DanhSachMon}</w:t>
+            </w:r>
+          </w:p>
+          <w:p>
+            <w:pPr>
+              <w:pStyle w:val="TableParagraph"/>
+            </w:pPr>
+            <w:r>
+              <w:rPr>
+                <w:b/>
+                <w:i/>
+                <w:sz w:val="10"/>
+              </w:rPr>
+              <w:t>{GhiChuMenu}</w:t>
+            </w:r>
+          </w:p>
+          <w:p>
+            <w:r>
+              <w:t>{/DanhSachMenu}</w:t>
             </w:r>
           </w:p>
         </w:tc>
@@ -4071,401 +2575,13 @@
             </w:tcBorders>
           </w:tcPr>
           <w:p>
-            <w:pPr>
-              <w:pStyle w:val="TableParagraph"/>
-              <w:spacing w:line="264" w:lineRule="auto" w:before="7"/>
-              <w:ind w:left="22" w:right="868"/>
-              <w:jc w:val="both"/>
-              <w:rPr>
-                <w:sz w:val="14"/>
-              </w:rPr>
-            </w:pPr>
-            <w:r>
-              <w:rPr>
-                <w:sz w:val="14"/>
-              </w:rPr>
-              <w:t>Thực đơn:</w:t>
-            </w:r>
-            <w:r>
-              <w:rPr>
-                <w:spacing w:val="40"/>
-                <w:sz w:val="14"/>
-              </w:rPr>
-              <w:t> </w:t>
-            </w:r>
-            <w:r>
-              <w:rPr>
-                <w:sz w:val="14"/>
-              </w:rPr>
-              <w:t>5.600.000VNĐ/ bàn/ 10 khách</w:t>
-            </w:r>
-            <w:r>
-              <w:rPr>
-                <w:spacing w:val="40"/>
-                <w:sz w:val="14"/>
-              </w:rPr>
-              <w:t> </w:t>
-            </w:r>
-            <w:r>
-              <w:rPr>
-                <w:sz w:val="14"/>
-              </w:rPr>
-              <w:t>Phí phục vụ: 180.000 VNĐ/ bàn/ 10 </w:t>
-            </w:r>
-            <w:r>
-              <w:rPr>
-                <w:sz w:val="14"/>
-              </w:rPr>
-              <w:t>khách</w:t>
-            </w:r>
-            <w:r>
-              <w:rPr>
-                <w:spacing w:val="40"/>
-                <w:sz w:val="14"/>
-              </w:rPr>
-              <w:t> </w:t>
-            </w:r>
-            <w:r>
-              <w:rPr>
-                <w:sz w:val="14"/>
-              </w:rPr>
-              <w:t>Phụ thu phí sảnh: 2.000.000VNĐ</w:t>
-            </w:r>
-          </w:p>
-          <w:p>
-            <w:pPr>
-              <w:pStyle w:val="TableParagraph"/>
-              <w:spacing w:line="264" w:lineRule="auto" w:before="1"/>
-              <w:ind w:left="22" w:right="694"/>
-              <w:rPr>
-                <w:sz w:val="14"/>
-              </w:rPr>
-            </w:pPr>
-            <w:r>
-              <w:rPr>
-                <w:sz w:val="14"/>
-              </w:rPr>
-              <w:t>Phí đổi bia Tiger lon xanh: 100.000VNĐ/Bàn</w:t>
-            </w:r>
-            <w:r>
-              <w:rPr>
-                <w:spacing w:val="40"/>
-                <w:sz w:val="14"/>
-              </w:rPr>
-              <w:t> </w:t>
-            </w:r>
-            <w:r>
-              <w:rPr>
-                <w:sz w:val="14"/>
-              </w:rPr>
-              <w:t>Bù phí MC suốt tiệc: 200.000VNĐ</w:t>
-            </w:r>
-          </w:p>
-          <w:p>
-            <w:pPr>
-              <w:pStyle w:val="TableParagraph"/>
-              <w:spacing w:line="271" w:lineRule="auto" w:before="1"/>
-              <w:ind w:left="22" w:right="1134"/>
-              <w:rPr>
-                <w:sz w:val="14"/>
-              </w:rPr>
-            </w:pPr>
-            <w:r>
-              <w:rPr>
-                <w:sz w:val="14"/>
-              </w:rPr>
-              <w:t>Màn hình chạy</w:t>
-            </w:r>
-            <w:r>
-              <w:rPr>
-                <w:spacing w:val="-1"/>
-                <w:sz w:val="14"/>
-              </w:rPr>
-              <w:t> </w:t>
-            </w:r>
-            <w:r>
-              <w:rPr>
-                <w:sz w:val="14"/>
-              </w:rPr>
-              <w:t>chữ (19h30 - </w:t>
-            </w:r>
-            <w:r>
-              <w:rPr>
-                <w:sz w:val="14"/>
-              </w:rPr>
-              <w:t>21h30):</w:t>
-            </w:r>
-            <w:r>
-              <w:rPr>
-                <w:spacing w:val="40"/>
-                <w:sz w:val="14"/>
-              </w:rPr>
-              <w:t> </w:t>
-            </w:r>
-            <w:r>
-              <w:rPr>
-                <w:spacing w:val="-2"/>
-                <w:sz w:val="14"/>
-              </w:rPr>
-              <w:t>1.000.000VNĐ/show</w:t>
-            </w:r>
-          </w:p>
-          <w:p>
-            <w:pPr>
-              <w:pStyle w:val="TableParagraph"/>
-              <w:spacing w:line="264" w:lineRule="auto" w:before="1"/>
-              <w:ind w:left="22" w:right="183"/>
-              <w:rPr>
-                <w:b/>
-                <w:sz w:val="14"/>
-              </w:rPr>
-            </w:pPr>
-            <w:r>
-              <w:rPr>
-                <w:b/>
-                <w:sz w:val="14"/>
-                <w:u w:val="single"/>
-              </w:rPr>
-              <w:t>Cách tính bàn tăng và các dịch vụ phát sinh trong </w:t>
-            </w:r>
-            <w:r>
-              <w:rPr>
-                <w:b/>
-                <w:spacing w:val="40"/>
-                <w:sz w:val="14"/>
-              </w:rPr>
-              <w:t> </w:t>
-            </w:r>
-            <w:r>
-              <w:rPr>
-                <w:b/>
-                <w:spacing w:val="-2"/>
-                <w:sz w:val="14"/>
-                <w:u w:val="single"/>
-              </w:rPr>
-              <w:t>tiệc:</w:t>
-            </w:r>
-          </w:p>
-          <w:p>
-            <w:pPr>
-              <w:pStyle w:val="TableParagraph"/>
-              <w:spacing w:line="264" w:lineRule="auto" w:before="1"/>
-              <w:ind w:left="22" w:right="183"/>
-              <w:rPr>
-                <w:sz w:val="14"/>
-              </w:rPr>
-            </w:pPr>
-            <w:r>
-              <w:rPr>
-                <w:sz w:val="14"/>
-              </w:rPr>
-              <w:t>1/ Tăng từ bàn số 40 cộng thêm 10% dựa trên giá bàn</w:t>
-            </w:r>
-            <w:r>
-              <w:rPr>
-                <w:spacing w:val="40"/>
-                <w:sz w:val="14"/>
-              </w:rPr>
-              <w:t> </w:t>
-            </w:r>
-            <w:r>
-              <w:rPr>
-                <w:sz w:val="14"/>
-              </w:rPr>
-              <w:t>chính</w:t>
-            </w:r>
-            <w:r>
-              <w:rPr>
-                <w:spacing w:val="-4"/>
-                <w:sz w:val="14"/>
-              </w:rPr>
-              <w:t> </w:t>
-            </w:r>
-            <w:r>
-              <w:rPr>
-                <w:sz w:val="14"/>
-              </w:rPr>
-              <w:t>thức.</w:t>
-            </w:r>
-          </w:p>
-          <w:p>
-            <w:pPr>
-              <w:pStyle w:val="TableParagraph"/>
-              <w:spacing w:before="1"/>
-              <w:ind w:left="22"/>
-              <w:rPr>
-                <w:sz w:val="14"/>
-              </w:rPr>
-            </w:pPr>
-            <w:r>
-              <w:rPr>
-                <w:sz w:val="14"/>
-              </w:rPr>
-              <w:t>2/</w:t>
-            </w:r>
-            <w:r>
-              <w:rPr>
-                <w:spacing w:val="2"/>
-                <w:sz w:val="14"/>
-              </w:rPr>
-              <w:t> </w:t>
-            </w:r>
-            <w:r>
-              <w:rPr>
-                <w:sz w:val="14"/>
-              </w:rPr>
-              <w:t>Ban</w:t>
-            </w:r>
-            <w:r>
-              <w:rPr>
-                <w:spacing w:val="5"/>
-                <w:sz w:val="14"/>
-              </w:rPr>
-              <w:t> </w:t>
-            </w:r>
-            <w:r>
-              <w:rPr>
-                <w:sz w:val="14"/>
-              </w:rPr>
-              <w:t>nhạc</w:t>
-            </w:r>
-            <w:r>
-              <w:rPr>
-                <w:spacing w:val="5"/>
-                <w:sz w:val="14"/>
-              </w:rPr>
-              <w:t> </w:t>
-            </w:r>
-            <w:r>
-              <w:rPr>
-                <w:sz w:val="14"/>
-              </w:rPr>
-              <w:t>phát</w:t>
-            </w:r>
-            <w:r>
-              <w:rPr>
-                <w:spacing w:val="6"/>
-                <w:sz w:val="14"/>
-              </w:rPr>
-              <w:t> </w:t>
-            </w:r>
-            <w:r>
-              <w:rPr>
-                <w:sz w:val="14"/>
-              </w:rPr>
-              <w:t>sinh</w:t>
-            </w:r>
-            <w:r>
-              <w:rPr>
-                <w:spacing w:val="5"/>
-                <w:sz w:val="14"/>
-              </w:rPr>
-              <w:t> </w:t>
-            </w:r>
-            <w:r>
-              <w:rPr>
-                <w:sz w:val="14"/>
-              </w:rPr>
-              <w:t>tính</w:t>
-            </w:r>
-            <w:r>
-              <w:rPr>
-                <w:spacing w:val="5"/>
-                <w:sz w:val="14"/>
-              </w:rPr>
-              <w:t> </w:t>
-            </w:r>
-            <w:r>
-              <w:rPr>
-                <w:sz w:val="14"/>
-              </w:rPr>
-              <w:t>phí</w:t>
-            </w:r>
-            <w:r>
-              <w:rPr>
-                <w:spacing w:val="5"/>
-                <w:sz w:val="14"/>
-              </w:rPr>
-              <w:t> </w:t>
-            </w:r>
-            <w:r>
-              <w:rPr>
-                <w:sz w:val="14"/>
-              </w:rPr>
-              <w:t>1.200.000VNĐ/30</w:t>
-            </w:r>
-            <w:r>
-              <w:rPr>
-                <w:spacing w:val="5"/>
-                <w:sz w:val="14"/>
-              </w:rPr>
-              <w:t> </w:t>
-            </w:r>
-            <w:r>
-              <w:rPr>
-                <w:spacing w:val="-4"/>
-                <w:sz w:val="14"/>
-              </w:rPr>
-              <w:t>phút</w:t>
-            </w:r>
-          </w:p>
-          <w:p>
-            <w:pPr>
-              <w:pStyle w:val="TableParagraph"/>
-              <w:spacing w:line="264" w:lineRule="auto" w:before="17"/>
-              <w:ind w:left="22"/>
-              <w:rPr>
-                <w:sz w:val="14"/>
-              </w:rPr>
-            </w:pPr>
-            <w:r>
-              <w:rPr>
-                <w:sz w:val="14"/>
-              </w:rPr>
-              <w:t>3/ Màn hình chạy chữ phát sinh tính phí 500.000VNĐ/30</w:t>
-            </w:r>
-            <w:r>
-              <w:rPr>
-                <w:spacing w:val="40"/>
-                <w:sz w:val="14"/>
-              </w:rPr>
-              <w:t> </w:t>
-            </w:r>
-            <w:r>
-              <w:rPr>
-                <w:spacing w:val="-4"/>
-                <w:sz w:val="14"/>
-              </w:rPr>
-              <w:t>phút</w:t>
-            </w:r>
-          </w:p>
-          <w:p>
-            <w:pPr>
-              <w:pStyle w:val="TableParagraph"/>
-              <w:spacing w:line="266" w:lineRule="auto" w:before="1"/>
-              <w:ind w:left="22"/>
-              <w:rPr>
-                <w:sz w:val="14"/>
-              </w:rPr>
-            </w:pPr>
-            <w:r>
-              <w:rPr>
-                <w:sz w:val="14"/>
-              </w:rPr>
-              <w:t>4/ Bia bàn dự phòng, bàn phát sinh tính phí</w:t>
-            </w:r>
-            <w:r>
-              <w:rPr>
-                <w:spacing w:val="40"/>
-                <w:sz w:val="14"/>
-              </w:rPr>
-              <w:t> </w:t>
-            </w:r>
-            <w:r>
-              <w:rPr>
-                <w:sz w:val="14"/>
-              </w:rPr>
-              <w:t>1.050.000VNĐ/bàn, lẻ 25.000VNĐ/lon</w:t>
+            <w:r>
+              <w:t>{@DichVuTinhPhi}</w:t>
+            </w:r>
+          </w:p>
+          <w:p>
+            <w:r>
+              <w:t>{@LuuY}</w:t>
             </w:r>
           </w:p>
         </w:tc>
@@ -4481,38 +2597,59 @@
             <w:shd w:val="clear" w:color="auto" w:fill="F1F1F1"/>
           </w:tcPr>
           <w:p>
-            <w:pPr>
-              <w:pStyle w:val="TableParagraph"/>
-              <w:spacing w:before="105"/>
-              <w:ind w:left="6"/>
-              <w:jc w:val="center"/>
-              <w:rPr>
-                <w:b/>
-                <w:sz w:val="14"/>
-              </w:rPr>
-            </w:pPr>
-            <w:r>
-              <w:rPr>
-                <w:b/>
-                <w:sz w:val="14"/>
-              </w:rPr>
-              <w:t>THỨC</w:t>
-            </w:r>
-            <w:r>
-              <w:rPr>
-                <w:b/>
-                <w:spacing w:val="8"/>
-                <w:sz w:val="14"/>
-              </w:rPr>
-              <w:t> </w:t>
-            </w:r>
-            <w:r>
-              <w:rPr>
-                <w:b/>
-                <w:spacing w:val="-4"/>
-                <w:sz w:val="14"/>
-              </w:rPr>
-              <w:t>UỐNG</w:t>
+            <w:r>
+              <w:t>{#DanhSachThucUong}</w:t>
+            </w:r>
+          </w:p>
+          <w:p>
+            <w:pPr>
+              <w:pStyle w:val="TableParagraph"/>
+            </w:pPr>
+            <w:r>
+              <w:rPr>
+                <w:b/>
+                <w:sz w:val="10"/>
+              </w:rPr>
+              <w:t>THỨC UỐNG: {TenThucUong}</w:t>
+            </w:r>
+          </w:p>
+          <w:p>
+            <w:r>
+              <w:t>{#DanhSachMonUong}</w:t>
+            </w:r>
+          </w:p>
+          <w:p>
+            <w:pPr>
+              <w:pStyle w:val="TableParagraph"/>
+            </w:pPr>
+            <w:r>
+              <w:rPr>
+                <w:sz w:val="10"/>
+              </w:rPr>
+              <w:t>{STT}. {TenMonUong}</w:t>
+            </w:r>
+          </w:p>
+          <w:p>
+            <w:r>
+              <w:t>{/DanhSachMonUong}</w:t>
+            </w:r>
+          </w:p>
+          <w:p>
+            <w:pPr>
+              <w:pStyle w:val="TableParagraph"/>
+            </w:pPr>
+            <w:r>
+              <w:rPr>
+                <w:b/>
+                <w:i/>
+                <w:sz w:val="10"/>
+              </w:rPr>
+              <w:t>{GhiChuThucUong}</w:t>
+            </w:r>
+          </w:p>
+          <w:p>
+            <w:r>
+              <w:t>{/DanhSachThucUong}</w:t>
             </w:r>
           </w:p>
         </w:tc>
@@ -4574,219 +2711,59 @@
             </w:tcBorders>
           </w:tcPr>
           <w:p>
-            <w:pPr>
-              <w:pStyle w:val="TableParagraph"/>
-              <w:spacing w:before="146"/>
-              <w:ind w:left="22"/>
-              <w:rPr>
-                <w:sz w:val="14"/>
-              </w:rPr>
-            </w:pPr>
-            <w:r>
-              <w:rPr>
-                <w:sz w:val="14"/>
-              </w:rPr>
-              <w:t>Nước</w:t>
-            </w:r>
-            <w:r>
-              <w:rPr>
-                <w:spacing w:val="5"/>
-                <w:sz w:val="14"/>
-              </w:rPr>
-              <w:t> </w:t>
-            </w:r>
-            <w:r>
-              <w:rPr>
-                <w:sz w:val="14"/>
-              </w:rPr>
-              <w:t>ngọt,</w:t>
-            </w:r>
-            <w:r>
-              <w:rPr>
-                <w:spacing w:val="6"/>
-                <w:sz w:val="14"/>
-              </w:rPr>
-              <w:t> </w:t>
-            </w:r>
-            <w:r>
-              <w:rPr>
-                <w:sz w:val="14"/>
-              </w:rPr>
-              <w:t>nước</w:t>
-            </w:r>
-            <w:r>
-              <w:rPr>
-                <w:spacing w:val="5"/>
-                <w:sz w:val="14"/>
-              </w:rPr>
-              <w:t> </w:t>
-            </w:r>
-            <w:r>
-              <w:rPr>
-                <w:sz w:val="14"/>
-              </w:rPr>
-              <w:t>suối</w:t>
-            </w:r>
-            <w:r>
-              <w:rPr>
-                <w:spacing w:val="6"/>
-                <w:sz w:val="14"/>
-              </w:rPr>
-              <w:t> </w:t>
-            </w:r>
-            <w:r>
-              <w:rPr>
-                <w:sz w:val="14"/>
-              </w:rPr>
-              <w:t>suốt</w:t>
-            </w:r>
-            <w:r>
-              <w:rPr>
-                <w:spacing w:val="5"/>
-                <w:sz w:val="14"/>
-              </w:rPr>
-              <w:t> </w:t>
-            </w:r>
-            <w:r>
-              <w:rPr>
-                <w:spacing w:val="-4"/>
-                <w:sz w:val="14"/>
-              </w:rPr>
-              <w:t>tiệc</w:t>
-            </w:r>
-          </w:p>
-          <w:p>
-            <w:pPr>
-              <w:pStyle w:val="TableParagraph"/>
-              <w:spacing w:before="17"/>
-              <w:ind w:left="22"/>
-              <w:rPr>
-                <w:sz w:val="14"/>
-              </w:rPr>
-            </w:pPr>
-            <w:r>
-              <w:rPr>
-                <w:sz w:val="14"/>
-              </w:rPr>
-              <w:t>Bia</w:t>
-            </w:r>
-            <w:r>
-              <w:rPr>
-                <w:spacing w:val="4"/>
-                <w:sz w:val="14"/>
-              </w:rPr>
-              <w:t> </w:t>
-            </w:r>
-            <w:r>
-              <w:rPr>
-                <w:sz w:val="14"/>
-              </w:rPr>
-              <w:t>Tiger</w:t>
-            </w:r>
-            <w:r>
-              <w:rPr>
-                <w:spacing w:val="5"/>
-                <w:sz w:val="14"/>
-              </w:rPr>
-              <w:t> </w:t>
-            </w:r>
-            <w:r>
-              <w:rPr>
-                <w:sz w:val="14"/>
-              </w:rPr>
-              <w:t>lon</w:t>
-            </w:r>
-            <w:r>
-              <w:rPr>
-                <w:spacing w:val="5"/>
-                <w:sz w:val="14"/>
-              </w:rPr>
-              <w:t> </w:t>
-            </w:r>
-            <w:r>
-              <w:rPr>
-                <w:sz w:val="14"/>
-              </w:rPr>
-              <w:t>xanh</w:t>
-            </w:r>
-            <w:r>
-              <w:rPr>
-                <w:spacing w:val="5"/>
-                <w:sz w:val="14"/>
-              </w:rPr>
-              <w:t> </w:t>
-            </w:r>
-            <w:r>
-              <w:rPr>
-                <w:sz w:val="14"/>
-              </w:rPr>
-              <w:t>330ml</w:t>
-            </w:r>
-            <w:r>
-              <w:rPr>
-                <w:spacing w:val="5"/>
-                <w:sz w:val="14"/>
-              </w:rPr>
-              <w:t> </w:t>
-            </w:r>
-            <w:r>
-              <w:rPr>
-                <w:sz w:val="14"/>
-              </w:rPr>
-              <w:t>trong</w:t>
-            </w:r>
-            <w:r>
-              <w:rPr>
-                <w:spacing w:val="1"/>
-                <w:sz w:val="14"/>
-              </w:rPr>
-              <w:t> </w:t>
-            </w:r>
-            <w:r>
-              <w:rPr>
-                <w:sz w:val="14"/>
-              </w:rPr>
-              <w:t>2,5</w:t>
-            </w:r>
-            <w:r>
-              <w:rPr>
-                <w:spacing w:val="5"/>
-                <w:sz w:val="14"/>
-              </w:rPr>
-              <w:t> </w:t>
-            </w:r>
-            <w:r>
-              <w:rPr>
-                <w:sz w:val="14"/>
-              </w:rPr>
-              <w:t>giờ</w:t>
-            </w:r>
-            <w:r>
-              <w:rPr>
-                <w:spacing w:val="5"/>
-                <w:sz w:val="14"/>
-              </w:rPr>
-              <w:t> </w:t>
-            </w:r>
-            <w:r>
-              <w:rPr>
-                <w:sz w:val="14"/>
-              </w:rPr>
-              <w:t>(36</w:t>
-            </w:r>
-            <w:r>
-              <w:rPr>
-                <w:spacing w:val="4"/>
-                <w:sz w:val="14"/>
-              </w:rPr>
-              <w:t> </w:t>
-            </w:r>
-            <w:r>
-              <w:rPr>
-                <w:spacing w:val="-4"/>
-                <w:sz w:val="14"/>
-              </w:rPr>
-              <w:t>bàn)</w:t>
+            <w:r>
+              <w:t>{#DanhSachThucUong}</w:t>
+            </w:r>
+          </w:p>
+          <w:p>
+            <w:pPr>
+              <w:pStyle w:val="TableParagraph"/>
+            </w:pPr>
+            <w:r>
+              <w:rPr>
+                <w:b/>
+                <w:sz w:val="10"/>
+              </w:rPr>
+              <w:t>THỨC UỐNG: {TenThucUong}</w:t>
+            </w:r>
+          </w:p>
+          <w:p>
+            <w:r>
+              <w:t>{#DanhSachMonUong}</w:t>
+            </w:r>
+          </w:p>
+          <w:p>
+            <w:pPr>
+              <w:pStyle w:val="TableParagraph"/>
+            </w:pPr>
+            <w:r>
+              <w:rPr>
+                <w:sz w:val="10"/>
+              </w:rPr>
+              <w:t>{STT}. {TenMonUong}</w:t>
+            </w:r>
+          </w:p>
+          <w:p>
+            <w:r>
+              <w:t>{/DanhSachMonUong}</w:t>
+            </w:r>
+          </w:p>
+          <w:p>
+            <w:pPr>
+              <w:pStyle w:val="TableParagraph"/>
+            </w:pPr>
+            <w:r>
+              <w:rPr>
+                <w:b/>
+                <w:i/>
+                <w:sz w:val="10"/>
+              </w:rPr>
+              <w:t>{GhiChuThucUong}</w:t>
+            </w:r>
+          </w:p>
+          <w:p>
+            <w:r>
+              <w:t>{/DanhSachThucUong}</w:t>
             </w:r>
           </w:p>
         </w:tc>
@@ -5116,301 +3093,37 @@
             </w:tcBorders>
           </w:tcPr>
           <w:p>
-            <w:pPr>
-              <w:pStyle w:val="TableParagraph"/>
-              <w:spacing w:line="156" w:lineRule="exact"/>
-              <w:ind w:left="22"/>
-              <w:rPr>
-                <w:b/>
-                <w:sz w:val="14"/>
-              </w:rPr>
-            </w:pPr>
-            <w:r>
-              <w:rPr>
-                <w:b/>
-                <w:sz w:val="14"/>
-              </w:rPr>
-              <w:t>Phương</w:t>
-            </w:r>
-            <w:r>
-              <w:rPr>
-                <w:b/>
-                <w:spacing w:val="5"/>
-                <w:sz w:val="14"/>
-              </w:rPr>
-              <w:t> </w:t>
-            </w:r>
-            <w:r>
-              <w:rPr>
-                <w:b/>
-                <w:sz w:val="14"/>
-              </w:rPr>
-              <w:t>thức</w:t>
-            </w:r>
-            <w:r>
-              <w:rPr>
-                <w:b/>
-                <w:spacing w:val="5"/>
-                <w:sz w:val="14"/>
-              </w:rPr>
-              <w:t> </w:t>
-            </w:r>
-            <w:r>
-              <w:rPr>
-                <w:b/>
-                <w:sz w:val="14"/>
-              </w:rPr>
-              <w:t>thanh</w:t>
-            </w:r>
-            <w:r>
-              <w:rPr>
-                <w:b/>
-                <w:spacing w:val="4"/>
-                <w:sz w:val="14"/>
-              </w:rPr>
-              <w:t> </w:t>
-            </w:r>
-            <w:r>
-              <w:rPr>
-                <w:b/>
-                <w:spacing w:val="-2"/>
-                <w:sz w:val="14"/>
-              </w:rPr>
-              <w:t>toán:</w:t>
-            </w:r>
-          </w:p>
-          <w:p>
-            <w:pPr>
-              <w:pStyle w:val="TableParagraph"/>
-              <w:spacing w:before="16"/>
-              <w:ind w:left="22"/>
-              <w:rPr>
-                <w:sz w:val="14"/>
-              </w:rPr>
-            </w:pPr>
-            <w:r>
-              <w:rPr>
-                <w:sz w:val="14"/>
-              </w:rPr>
-              <w:t>Lần</w:t>
-            </w:r>
-            <w:r>
-              <w:rPr>
-                <w:spacing w:val="3"/>
-                <w:sz w:val="14"/>
-              </w:rPr>
-              <w:t> </w:t>
-            </w:r>
-            <w:r>
-              <w:rPr>
-                <w:sz w:val="14"/>
-              </w:rPr>
-              <w:t>1:</w:t>
-            </w:r>
-            <w:r>
-              <w:rPr>
-                <w:spacing w:val="39"/>
-                <w:sz w:val="14"/>
-              </w:rPr>
-              <w:t> </w:t>
-            </w:r>
-            <w:r>
-              <w:rPr>
-                <w:sz w:val="14"/>
-              </w:rPr>
-              <w:t>10.000.000</w:t>
-            </w:r>
-            <w:r>
-              <w:rPr>
-                <w:spacing w:val="4"/>
-                <w:sz w:val="14"/>
-              </w:rPr>
-              <w:t> </w:t>
-            </w:r>
-            <w:r>
-              <w:rPr>
-                <w:sz w:val="14"/>
-              </w:rPr>
-              <w:t>VNĐ</w:t>
-            </w:r>
-            <w:r>
-              <w:rPr>
-                <w:spacing w:val="3"/>
-                <w:sz w:val="14"/>
-              </w:rPr>
-              <w:t> </w:t>
-            </w:r>
-            <w:r>
-              <w:rPr>
-                <w:sz w:val="14"/>
-              </w:rPr>
-              <w:t>-</w:t>
-            </w:r>
-            <w:r>
-              <w:rPr>
-                <w:spacing w:val="1"/>
-                <w:sz w:val="14"/>
-              </w:rPr>
-              <w:t> </w:t>
-            </w:r>
-            <w:r>
-              <w:rPr>
-                <w:spacing w:val="-5"/>
-                <w:sz w:val="14"/>
-              </w:rPr>
-              <w:t>CK</w:t>
-            </w:r>
-          </w:p>
-          <w:p>
-            <w:pPr>
-              <w:pStyle w:val="TableParagraph"/>
-              <w:spacing w:before="17"/>
-              <w:ind w:left="22"/>
-              <w:rPr>
-                <w:sz w:val="14"/>
-              </w:rPr>
-            </w:pPr>
-            <w:r>
-              <w:rPr>
-                <w:sz w:val="14"/>
-              </w:rPr>
-              <w:t>Lần</w:t>
-            </w:r>
-            <w:r>
-              <w:rPr>
-                <w:spacing w:val="4"/>
-                <w:sz w:val="14"/>
-              </w:rPr>
-              <w:t> </w:t>
-            </w:r>
-            <w:r>
-              <w:rPr>
-                <w:sz w:val="14"/>
-              </w:rPr>
-              <w:t>2:</w:t>
-            </w:r>
-            <w:r>
-              <w:rPr>
-                <w:spacing w:val="39"/>
-                <w:sz w:val="14"/>
-              </w:rPr>
-              <w:t> </w:t>
-            </w:r>
-            <w:r>
-              <w:rPr>
-                <w:sz w:val="14"/>
-              </w:rPr>
-              <w:t>100.000.000</w:t>
-            </w:r>
-            <w:r>
-              <w:rPr>
-                <w:spacing w:val="4"/>
-                <w:sz w:val="14"/>
-              </w:rPr>
-              <w:t> </w:t>
-            </w:r>
-            <w:r>
-              <w:rPr>
-                <w:sz w:val="14"/>
-              </w:rPr>
-              <w:t>VNĐ</w:t>
-            </w:r>
-            <w:r>
-              <w:rPr>
-                <w:spacing w:val="3"/>
-                <w:sz w:val="14"/>
-              </w:rPr>
-              <w:t> </w:t>
-            </w:r>
-            <w:r>
-              <w:rPr>
-                <w:sz w:val="14"/>
-              </w:rPr>
-              <w:t>-</w:t>
-            </w:r>
-            <w:r>
-              <w:rPr>
-                <w:spacing w:val="1"/>
-                <w:sz w:val="14"/>
-              </w:rPr>
-              <w:t> </w:t>
-            </w:r>
-            <w:r>
-              <w:rPr>
-                <w:spacing w:val="-5"/>
-                <w:sz w:val="14"/>
-              </w:rPr>
-              <w:t>CK</w:t>
-            </w:r>
-          </w:p>
-          <w:p>
-            <w:pPr>
-              <w:pStyle w:val="TableParagraph"/>
-              <w:spacing w:line="143" w:lineRule="exact" w:before="21"/>
-              <w:ind w:left="22"/>
-              <w:rPr>
-                <w:sz w:val="14"/>
-              </w:rPr>
-            </w:pPr>
-            <w:r>
-              <w:rPr>
-                <w:b/>
-                <w:sz w:val="14"/>
-              </w:rPr>
-              <w:t>Thanh</w:t>
-            </w:r>
-            <w:r>
-              <w:rPr>
-                <w:b/>
-                <w:spacing w:val="2"/>
-                <w:sz w:val="14"/>
-              </w:rPr>
-              <w:t> </w:t>
-            </w:r>
-            <w:r>
-              <w:rPr>
-                <w:b/>
-                <w:sz w:val="14"/>
-              </w:rPr>
-              <w:t>toán</w:t>
-            </w:r>
-            <w:r>
-              <w:rPr>
-                <w:b/>
-                <w:spacing w:val="2"/>
-                <w:sz w:val="14"/>
-              </w:rPr>
-              <w:t> </w:t>
-            </w:r>
-            <w:r>
-              <w:rPr>
-                <w:b/>
-                <w:sz w:val="14"/>
-              </w:rPr>
-              <w:t>cuối</w:t>
-            </w:r>
-            <w:r>
-              <w:rPr>
-                <w:b/>
-                <w:spacing w:val="3"/>
-                <w:sz w:val="14"/>
-              </w:rPr>
-              <w:t> </w:t>
-            </w:r>
-            <w:r>
-              <w:rPr>
-                <w:b/>
-                <w:spacing w:val="-4"/>
-                <w:sz w:val="14"/>
-              </w:rPr>
-              <w:t>tiệc</w:t>
-            </w:r>
-            <w:r>
-              <w:rPr>
-                <w:spacing w:val="-4"/>
-                <w:sz w:val="14"/>
-              </w:rPr>
-              <w:t>.</w:t>
+            <w:r>
+              <w:rPr>
+                <w:b/>
+                <w:sz w:val="20"/>
+              </w:rPr>
+              <w:t>Phương thức thanh toán:</w:t>
+            </w:r>
+          </w:p>
+          <w:p>
+            <w:r>
+              <w:t>{#LichTrinhThanhToan}</w:t>
+            </w:r>
+          </w:p>
+          <w:p>
+            <w:r>
+              <w:rPr>
+                <w:b/>
+                <w:sz w:val="20"/>
+              </w:rPr>
+              <w:t>Lần {STT}: </w:t>
+            </w:r>
+            <w:r>
+              <w:rPr>
+                <w:sz w:val="20"/>
+              </w:rPr>
+              <w:t>{SoTien} - {NoiDung}</w:t>
+            </w:r>
+          </w:p>
+          <w:p>
+            <w:r>
+              <w:t>{/LichTrinhThanhToan}</w:t>
             </w:r>
           </w:p>
         </w:tc>
@@ -5624,7 +3337,7 @@
                 <w:b/>
                 <w:sz w:val="14"/>
               </w:rPr>
-              <w:t>LỄ THÀNH HÔN</w:t>
+              <w:t>{TenLe}</w:t>
             </w:r>
             <w:r>
               <w:rPr>
@@ -5639,14 +3352,7 @@
                 <w:b/>
                 <w:sz w:val="14"/>
               </w:rPr>
-              <w:t>PHƯƠNG DUY - THU </w:t>
-            </w:r>
-            <w:r>
-              <w:rPr>
-                <w:b/>
-                <w:sz w:val="14"/>
-              </w:rPr>
-              <w:t>PHƯỢNG</w:t>
+              <w:t>{BieuNguCR} - {BieuNguCD}</w:t>
             </w:r>
           </w:p>
           <w:p>
@@ -5666,7 +3372,7 @@
                 <w:spacing w:val="-2"/>
                 <w:sz w:val="14"/>
               </w:rPr>
-              <w:t>06.06.2026</w:t>
+              <w:t>{NgayToChuc}</w:t>
             </w:r>
           </w:p>
         </w:tc>

</xml_diff>

<commit_message>
feat: initialize base UI styling, document template placeholders, and core backend API procedures
</commit_message>
<xml_diff>
--- a/backend-app/samples/BEO_Tiec_Cuoi.docx
+++ b/backend-app/samples/BEO_Tiec_Cuoi.docx
@@ -291,7 +291,7 @@
               <w:rPr>
                 <w:sz w:val="14"/>
               </w:rPr>
-              <w:t>{BenA_NhanVienPhuTrach}</w:t>
+              <w:t>{BenANhanVienPhuTrach}</w:t>
             </w:r>
           </w:p>
         </w:tc>
@@ -318,7 +318,7 @@
                 <w:sz w:val="14"/>
                 <w:u w:val="single"/>
               </w:rPr>
-              <w:t>Tel: {BenA_SDT_NhanVien}</w:t>
+              <w:t>Tel: {BenASDT_NhanVien}</w:t>
             </w:r>
           </w:p>
         </w:tc>
@@ -919,7 +919,7 @@
               <w:rPr>
                 <w:sz w:val="14"/>
               </w:rPr>
-              <w:t>{BenB_DiaChi}</w:t>
+              <w:t>{BenBDiaChi}</w:t>
             </w:r>
           </w:p>
         </w:tc>

</xml_diff>

<commit_message>
refactor: migrate contract details from JSON columns to normalized tables and update database schema and API procedures
</commit_message>
<xml_diff>
--- a/backend-app/samples/BEO_Tiec_Cuoi.docx
+++ b/backend-app/samples/BEO_Tiec_Cuoi.docx
@@ -1823,7 +1823,7 @@
                 <w:b/>
                 <w:sz w:val="14"/>
               </w:rPr>
-              <w:t>{SanhDat}</w:t>
+              <w:t>{Sanh}</w:t>
             </w:r>
           </w:p>
         </w:tc>
@@ -2399,7 +2399,7 @@
                 <w:i/>
                 <w:sz w:val="10"/>
               </w:rPr>
-              <w:t>{GhiChuMenu}</w:t>
+              <w:t>{GhiChu}</w:t>
             </w:r>
           </w:p>
           <w:p>
@@ -2581,7 +2581,7 @@
           </w:p>
           <w:p>
             <w:r>
-              <w:t>{LuuY}</w:t>
+              <w:t>{GhiChu}</w:t>
             </w:r>
           </w:p>
         </w:tc>
@@ -2644,7 +2644,7 @@
                 <w:i/>
                 <w:sz w:val="10"/>
               </w:rPr>
-              <w:t>{GhiChuThucUong}</w:t>
+              <w:t>{GhiChu}</w:t>
             </w:r>
           </w:p>
           <w:p>
@@ -2758,7 +2758,7 @@
                 <w:i/>
                 <w:sz w:val="10"/>
               </w:rPr>
-              <w:t>{GhiChuThucUong}</w:t>
+              <w:t>{GhiChu}</w:t>
             </w:r>
           </w:p>
           <w:p>
@@ -3352,7 +3352,7 @@
                 <w:b/>
                 <w:sz w:val="14"/>
               </w:rPr>
-              <w:t>{BieuNguCR} - {BieuNguCD}</w:t>
+              <w:t>{Tenchure} - {Tencodau}</w:t>
             </w:r>
           </w:p>
           <w:p>

</xml_diff>

<commit_message>
feat: initialize backend server with document template management and SQL API integration
</commit_message>
<xml_diff>
--- a/backend-app/samples/BEO_Tiec_Cuoi.docx
+++ b/backend-app/samples/BEO_Tiec_Cuoi.docx
@@ -2576,12 +2576,12 @@
           </w:tcPr>
           <w:p>
             <w:r>
-              <w:t>{#DichVuTinhPhi}- {TenDichVu}: {DonGia} VNĐ ({GhiChu})\n{/DichVuTinhPhi}</w:t>
-            </w:r>
-          </w:p>
-          <w:p>
-            <w:r>
-              <w:t>{GhiChu}</w:t>
+              <w:t>{#DichVuTinhPhi}- {TenDichVu}: {DonGia} VNĐ ({LuuY})\n{/DichVuTinhPhi}</w:t>
+            </w:r>
+          </w:p>
+          <w:p>
+            <w:r>
+              <w:t>{LuuY}</w:t>
             </w:r>
           </w:p>
         </w:tc>
@@ -2710,62 +2710,7 @@
               <w:bottom w:val="single" w:sz="4" w:space="0" w:color="000000"/>
             </w:tcBorders>
           </w:tcPr>
-          <w:p>
-            <w:r>
-              <w:t>{#DanhSachThucUong}</w:t>
-            </w:r>
-          </w:p>
-          <w:p>
-            <w:pPr>
-              <w:pStyle w:val="TableParagraph"/>
-            </w:pPr>
-            <w:r>
-              <w:rPr>
-                <w:b/>
-                <w:sz w:val="10"/>
-              </w:rPr>
-              <w:t>THỨC UỐNG: {TenThucUong}</w:t>
-            </w:r>
-          </w:p>
-          <w:p>
-            <w:r>
-              <w:t>{#DanhSachMonUong}</w:t>
-            </w:r>
-          </w:p>
-          <w:p>
-            <w:pPr>
-              <w:pStyle w:val="TableParagraph"/>
-            </w:pPr>
-            <w:r>
-              <w:rPr>
-                <w:sz w:val="10"/>
-              </w:rPr>
-              <w:t>{STT}. {TenMonUong}</w:t>
-            </w:r>
-          </w:p>
-          <w:p>
-            <w:r>
-              <w:t>{/DanhSachMonUong}</w:t>
-            </w:r>
-          </w:p>
-          <w:p>
-            <w:pPr>
-              <w:pStyle w:val="TableParagraph"/>
-            </w:pPr>
-            <w:r>
-              <w:rPr>
-                <w:b/>
-                <w:i/>
-                <w:sz w:val="10"/>
-              </w:rPr>
-              <w:t>{GhiChu}</w:t>
-            </w:r>
-          </w:p>
-          <w:p>
-            <w:r>
-              <w:t>{/DanhSachThucUong}</w:t>
-            </w:r>
-          </w:p>
+          ___DRINKS_BLOCK_PLACEHOLDER___
         </w:tc>
       </w:tr>
       <w:tr>

</xml_diff>